<commit_message>
sngp: fl, td ready for printing, ib for printing on rs100 stamp paper
</commit_message>
<xml_diff>
--- a/sngp-125005252-MAK/SNGP-125005252-FL-26-01.docx
+++ b/sngp-125005252-MAK/SNGP-125005252-FL-26-01.docx
@@ -180,7 +180,25 @@
           <w:szCs w:val="20"/>
           <w:u w:val="none"/>
         </w:rPr>
-        <w:t>October 28, 2025</w:t>
+        <w:t>April 15</w:t>
+      </w:r>
+      <w:r>
+        <w:rPr>
+          <w:color w:val="auto"/>
+          <w:sz w:val="20"/>
+          <w:szCs w:val="20"/>
+          <w:u w:val="none"/>
+        </w:rPr>
+        <w:t>, 202</w:t>
+      </w:r>
+      <w:r>
+        <w:rPr>
+          <w:color w:val="auto"/>
+          <w:sz w:val="20"/>
+          <w:szCs w:val="20"/>
+          <w:u w:val="none"/>
+        </w:rPr>
+        <w:t>6</w:t>
       </w:r>
     </w:p>
     <w:p>
@@ -194,7 +212,6 @@
         <w:jc w:val="end"/>
         <w:rPr>
           <w:rFonts w:ascii="Calibri" w:hAnsi="Calibri"/>
-          <w:i w:val="false"/>
           <w:i w:val="false"/>
           <w:caps w:val="false"/>
           <w:smallCaps w:val="false"/>
@@ -216,45 +233,45 @@
       </w:r>
       <w:r>
         <w:rPr>
+          <w:i w:val="false"/>
+          <w:caps w:val="false"/>
           <w:smallCaps w:val="false"/>
+          <w:color w:val="auto"/>
+          <w:sz w:val="20"/>
+          <w:szCs w:val="20"/>
+        </w:rPr>
+        <w:instrText xml:space="preserve"> DOCPROPERTY "Reference"</w:instrText>
+      </w:r>
+      <w:r>
+        <w:rPr>
+          <w:i w:val="false"/>
           <w:caps w:val="false"/>
-          <w:sz w:val="20"/>
+          <w:smallCaps w:val="false"/>
+          <w:color w:val="auto"/>
+          <w:sz w:val="20"/>
+          <w:szCs w:val="20"/>
+        </w:rPr>
+        <w:fldChar w:fldCharType="separate"/>
+      </w:r>
+      <w:r>
+        <w:rPr>
           <w:i w:val="false"/>
-          <w:szCs w:val="20"/>
-          <w:color w:val="auto"/>
-        </w:rPr>
-        <w:instrText xml:space="preserve"> DOCPROPERTY "Reference"</w:instrText>
-      </w:r>
-      <w:r>
-        <w:rPr>
+          <w:caps w:val="false"/>
           <w:smallCaps w:val="false"/>
+          <w:color w:val="auto"/>
+          <w:sz w:val="20"/>
+          <w:szCs w:val="20"/>
+        </w:rPr>
+        <w:t>MAK-SNGP-26-01</w:t>
+      </w:r>
+      <w:r>
+        <w:rPr>
+          <w:i w:val="false"/>
           <w:caps w:val="false"/>
-          <w:sz w:val="20"/>
-          <w:i w:val="false"/>
-          <w:szCs w:val="20"/>
-          <w:color w:val="auto"/>
-        </w:rPr>
-        <w:fldChar w:fldCharType="separate"/>
-      </w:r>
-      <w:r>
-        <w:rPr>
           <w:smallCaps w:val="false"/>
-          <w:caps w:val="false"/>
-          <w:sz w:val="20"/>
-          <w:i w:val="false"/>
-          <w:szCs w:val="20"/>
-          <w:color w:val="auto"/>
-        </w:rPr>
-        <w:t>CDCSR-25-03-MAK-SNGP-125005252-FL</w:t>
-      </w:r>
-      <w:r>
-        <w:rPr>
-          <w:smallCaps w:val="false"/>
-          <w:caps w:val="false"/>
-          <w:sz w:val="20"/>
-          <w:i w:val="false"/>
-          <w:szCs w:val="20"/>
-          <w:color w:val="auto"/>
+          <w:color w:val="auto"/>
+          <w:sz w:val="20"/>
+          <w:szCs w:val="20"/>
         </w:rPr>
         <w:fldChar w:fldCharType="end"/>
       </w:r>
@@ -326,48 +343,12 @@
       </w:r>
       <w:r>
         <w:rPr>
-          <w:sz w:val="20"/>
-          <w:b/>
-          <w:szCs w:val="20"/>
-          <w:bCs/>
-        </w:rPr>
-        <w:instrText xml:space="preserve"> DOCPROPERTY "CoName"</w:instrText>
-      </w:r>
-      <w:r>
-        <w:rPr>
-          <w:sz w:val="20"/>
-          <w:b/>
-          <w:szCs w:val="20"/>
-          <w:bCs/>
-        </w:rPr>
-        <w:fldChar w:fldCharType="separate"/>
-      </w:r>
-      <w:r>
-        <w:rPr>
-          <w:sz w:val="20"/>
-          <w:b/>
-          <w:szCs w:val="20"/>
-          <w:bCs/>
-        </w:rPr>
-        <w:t>Sui Northern Gas Pipelines Limited</w:t>
-      </w:r>
-      <w:r>
-        <w:rPr>
-          <w:sz w:val="20"/>
-          <w:b/>
-          <w:szCs w:val="20"/>
-          <w:bCs/>
-        </w:rPr>
-        <w:fldChar w:fldCharType="end"/>
-      </w:r>
-      <w:r>
-        <w:rPr>
           <w:b/>
           <w:bCs/>
           <w:sz w:val="20"/>
           <w:szCs w:val="20"/>
         </w:rPr>
-        <w:t xml:space="preserve">, Folio #: </w:t>
+        <w:instrText xml:space="preserve"> DOCPROPERTY "CoName"</w:instrText>
       </w:r>
       <w:r>
         <w:rPr>
@@ -376,41 +357,77 @@
           <w:sz w:val="20"/>
           <w:szCs w:val="20"/>
         </w:rPr>
+        <w:fldChar w:fldCharType="separate"/>
+      </w:r>
+      <w:r>
+        <w:rPr>
+          <w:b/>
+          <w:bCs/>
+          <w:sz w:val="20"/>
+          <w:szCs w:val="20"/>
+        </w:rPr>
+        <w:t>Sui Northern Gas Pipelines Limited</w:t>
+      </w:r>
+      <w:r>
+        <w:rPr>
+          <w:b/>
+          <w:bCs/>
+          <w:sz w:val="20"/>
+          <w:szCs w:val="20"/>
+        </w:rPr>
+        <w:fldChar w:fldCharType="end"/>
+      </w:r>
+      <w:r>
+        <w:rPr>
+          <w:b/>
+          <w:bCs/>
+          <w:sz w:val="20"/>
+          <w:szCs w:val="20"/>
+        </w:rPr>
+        <w:t xml:space="preserve">, Folio #: </w:t>
+      </w:r>
+      <w:r>
+        <w:rPr>
+          <w:b/>
+          <w:bCs/>
+          <w:sz w:val="20"/>
+          <w:szCs w:val="20"/>
+        </w:rPr>
         <w:fldChar w:fldCharType="begin"/>
       </w:r>
       <w:r>
         <w:rPr>
-          <w:sz w:val="20"/>
           <w:b/>
-          <w:szCs w:val="20"/>
           <w:bCs/>
+          <w:sz w:val="20"/>
+          <w:szCs w:val="20"/>
         </w:rPr>
         <w:instrText xml:space="preserve"> DOCPROPERTY "CoFolio"</w:instrText>
       </w:r>
       <w:r>
         <w:rPr>
-          <w:sz w:val="20"/>
           <w:b/>
-          <w:szCs w:val="20"/>
           <w:bCs/>
+          <w:sz w:val="20"/>
+          <w:szCs w:val="20"/>
         </w:rPr>
         <w:fldChar w:fldCharType="separate"/>
       </w:r>
       <w:r>
         <w:rPr>
-          <w:sz w:val="20"/>
           <w:b/>
-          <w:szCs w:val="20"/>
           <w:bCs/>
+          <w:sz w:val="20"/>
+          <w:szCs w:val="20"/>
         </w:rPr>
         <w:t>125005252</w:t>
       </w:r>
       <w:r>
         <w:rPr>
-          <w:sz w:val="20"/>
           <w:b/>
-          <w:szCs w:val="20"/>
           <w:bCs/>
+          <w:sz w:val="20"/>
+          <w:szCs w:val="20"/>
         </w:rPr>
         <w:fldChar w:fldCharType="end"/>
       </w:r>
@@ -579,65 +596,65 @@
       </w:r>
       <w:r>
         <w:rPr>
+          <w:rFonts w:ascii="Arial" w:hAnsi="Arial"/>
+          <w:b w:val="false"/>
+          <w:i w:val="false"/>
+          <w:caps w:val="false"/>
           <w:smallCaps w:val="false"/>
+          <w:strike w:val="false"/>
+          <w:dstrike w:val="false"/>
+          <w:color w:val="auto"/>
+          <w:sz w:val="20"/>
+          <w:szCs w:val="20"/>
+          <w:u w:val="none"/>
+        </w:rPr>
+        <w:instrText xml:space="preserve"> DOCPROPERTY "ReferenceReceiving"</w:instrText>
+      </w:r>
+      <w:r>
+        <w:rPr>
+          <w:rFonts w:ascii="Arial" w:hAnsi="Arial"/>
+          <w:b w:val="false"/>
+          <w:i w:val="false"/>
           <w:caps w:val="false"/>
-          <w:dstrike w:val="false"/>
-          <w:strike w:val="false"/>
-          <w:sz w:val="20"/>
+          <w:smallCaps w:val="false"/>
+          <w:strike w:val="false"/>
+          <w:dstrike w:val="false"/>
+          <w:color w:val="auto"/>
+          <w:sz w:val="20"/>
+          <w:szCs w:val="20"/>
+          <w:u w:val="none"/>
+        </w:rPr>
+        <w:fldChar w:fldCharType="separate"/>
+      </w:r>
+      <w:r>
+        <w:rPr>
+          <w:rFonts w:ascii="Arial" w:hAnsi="Arial"/>
+          <w:b w:val="false"/>
           <w:i w:val="false"/>
-          <w:u w:val="none"/>
-          <w:b w:val="false"/>
-          <w:szCs w:val="20"/>
+          <w:caps w:val="false"/>
+          <w:smallCaps w:val="false"/>
+          <w:strike w:val="false"/>
+          <w:dstrike w:val="false"/>
+          <w:color w:val="auto"/>
+          <w:sz w:val="20"/>
+          <w:szCs w:val="20"/>
+          <w:u w:val="none"/>
+        </w:rPr>
+        <w:t>CDCSR/LTC/SNGP/177/24, CDCSR/SNGP/159/25, &amp; CDCSR/SNGP/230/25</w:t>
+      </w:r>
+      <w:r>
+        <w:rPr>
           <w:rFonts w:ascii="Arial" w:hAnsi="Arial"/>
-          <w:color w:val="auto"/>
-        </w:rPr>
-        <w:instrText xml:space="preserve"> DOCPROPERTY "ReferenceReceiving"</w:instrText>
-      </w:r>
-      <w:r>
-        <w:rPr>
+          <w:b w:val="false"/>
+          <w:i w:val="false"/>
+          <w:caps w:val="false"/>
           <w:smallCaps w:val="false"/>
-          <w:caps w:val="false"/>
-          <w:dstrike w:val="false"/>
-          <w:strike w:val="false"/>
-          <w:sz w:val="20"/>
-          <w:i w:val="false"/>
-          <w:u w:val="none"/>
-          <w:b w:val="false"/>
-          <w:szCs w:val="20"/>
-          <w:rFonts w:ascii="Arial" w:hAnsi="Arial"/>
-          <w:color w:val="auto"/>
-        </w:rPr>
-        <w:fldChar w:fldCharType="separate"/>
-      </w:r>
-      <w:r>
-        <w:rPr>
-          <w:smallCaps w:val="false"/>
-          <w:caps w:val="false"/>
-          <w:dstrike w:val="false"/>
-          <w:strike w:val="false"/>
-          <w:sz w:val="20"/>
-          <w:i w:val="false"/>
-          <w:u w:val="none"/>
-          <w:b w:val="false"/>
-          <w:szCs w:val="20"/>
-          <w:rFonts w:ascii="Arial" w:hAnsi="Arial"/>
-          <w:color w:val="auto"/>
-        </w:rPr>
-        <w:t>CDCSR/SNGP/230/25</w:t>
-      </w:r>
-      <w:r>
-        <w:rPr>
-          <w:smallCaps w:val="false"/>
-          <w:caps w:val="false"/>
-          <w:dstrike w:val="false"/>
-          <w:strike w:val="false"/>
-          <w:sz w:val="20"/>
-          <w:i w:val="false"/>
-          <w:u w:val="none"/>
-          <w:b w:val="false"/>
-          <w:szCs w:val="20"/>
-          <w:rFonts w:ascii="Arial" w:hAnsi="Arial"/>
-          <w:color w:val="auto"/>
+          <w:strike w:val="false"/>
+          <w:dstrike w:val="false"/>
+          <w:color w:val="auto"/>
+          <w:sz w:val="20"/>
+          <w:szCs w:val="20"/>
+          <w:u w:val="none"/>
         </w:rPr>
         <w:fldChar w:fldCharType="end"/>
       </w:r>
@@ -1044,31 +1061,7 @@
           <w:szCs w:val="20"/>
           <w:u w:val="none"/>
         </w:rPr>
-        <w:t xml:space="preserve">06 “Revenue Stamps” </w:t>
-      </w:r>
-      <w:r>
-        <w:rPr>
-          <w:b w:val="false"/>
-          <w:strike w:val="false"/>
-          <w:dstrike w:val="false"/>
-          <w:color w:val="auto"/>
-          <w:sz w:val="20"/>
-          <w:szCs w:val="20"/>
-          <w:u w:val="none"/>
-        </w:rPr>
-        <w:t>(</w:t>
-      </w:r>
-      <w:r>
-        <w:rPr>
-          <w:b w:val="false"/>
-          <w:strike w:val="false"/>
-          <w:dstrike w:val="false"/>
-          <w:color w:val="auto"/>
-          <w:sz w:val="20"/>
-          <w:szCs w:val="20"/>
-          <w:u w:val="none"/>
-        </w:rPr>
-        <w:t>@ Rs. 100/- each (total of Rs. 600/-).</w:t>
+        <w:t>06 “Revenue Stamps” (@ Rs. 100/- each (total of Rs. 600/-).</w:t>
       </w:r>
     </w:p>
     <w:p>
@@ -1114,16 +1107,120 @@
         <w:jc w:val="both"/>
         <w:rPr>
           <w:rFonts w:ascii="Calibri" w:hAnsi="Calibri"/>
-          <w:sz w:val="20"/>
-          <w:szCs w:val="20"/>
-        </w:rPr>
-      </w:pPr>
-      <w:r>
-        <w:rPr>
-          <w:sz w:val="20"/>
-          <w:szCs w:val="20"/>
-        </w:rPr>
-        <w:t>The legal heirs join me thanking you with kind regards.</w:t>
+          <w:b w:val="false"/>
+          <w:strike w:val="false"/>
+          <w:dstrike w:val="false"/>
+          <w:color w:val="auto"/>
+          <w:sz w:val="20"/>
+          <w:szCs w:val="20"/>
+          <w:u w:val="none"/>
+        </w:rPr>
+      </w:pPr>
+      <w:r>
+        <w:rPr>
+          <w:b w:val="false"/>
+          <w:strike w:val="false"/>
+          <w:dstrike w:val="false"/>
+          <w:color w:val="auto"/>
+          <w:sz w:val="20"/>
+          <w:szCs w:val="20"/>
+          <w:u w:val="none"/>
+        </w:rPr>
+        <w:t xml:space="preserve">Furthermore, I remain on standby to forward you the share certificates registered in the name of the subject deceased shareholder </w:t>
+      </w:r>
+      <w:r>
+        <w:rPr>
+          <w:b/>
+          <w:bCs/>
+          <w:strike w:val="false"/>
+          <w:dstrike w:val="false"/>
+          <w:color w:val="auto"/>
+          <w:sz w:val="20"/>
+          <w:szCs w:val="20"/>
+          <w:u w:val="single"/>
+        </w:rPr>
+        <w:t>only upon receipt of your further instruction</w:t>
+      </w:r>
+      <w:r>
+        <w:rPr>
+          <w:b w:val="false"/>
+          <w:strike w:val="false"/>
+          <w:dstrike w:val="false"/>
+          <w:color w:val="auto"/>
+          <w:sz w:val="20"/>
+          <w:szCs w:val="20"/>
+          <w:u w:val="none"/>
+        </w:rPr>
+        <w:t xml:space="preserve">. </w:t>
+      </w:r>
+    </w:p>
+    <w:p>
+      <w:pPr>
+        <w:pStyle w:val="Default"/>
+        <w:tabs>
+          <w:tab w:val="clear" w:pos="709"/>
+          <w:tab w:val="left" w:pos="400" w:leader="none"/>
+        </w:tabs>
+        <w:bidi w:val="0"/>
+        <w:jc w:val="both"/>
+        <w:rPr>
+          <w:rFonts w:ascii="Calibri" w:hAnsi="Calibri"/>
+          <w:b w:val="false"/>
+          <w:strike w:val="false"/>
+          <w:dstrike w:val="false"/>
+          <w:color w:val="auto"/>
+          <w:sz w:val="20"/>
+          <w:szCs w:val="20"/>
+          <w:u w:val="none"/>
+        </w:rPr>
+      </w:pPr>
+      <w:r>
+        <w:rPr>
+          <w:b w:val="false"/>
+          <w:strike w:val="false"/>
+          <w:dstrike w:val="false"/>
+          <w:color w:val="auto"/>
+          <w:sz w:val="20"/>
+          <w:szCs w:val="20"/>
+          <w:u w:val="none"/>
+        </w:rPr>
+      </w:r>
+    </w:p>
+    <w:p>
+      <w:pPr>
+        <w:pStyle w:val="Default"/>
+        <w:tabs>
+          <w:tab w:val="clear" w:pos="709"/>
+          <w:tab w:val="left" w:pos="400" w:leader="none"/>
+        </w:tabs>
+        <w:bidi w:val="0"/>
+        <w:jc w:val="both"/>
+        <w:rPr>
+          <w:rFonts w:ascii="Calibri" w:hAnsi="Calibri"/>
+          <w:sz w:val="20"/>
+          <w:szCs w:val="20"/>
+        </w:rPr>
+      </w:pPr>
+      <w:r>
+        <w:rPr>
+          <w:sz w:val="20"/>
+          <w:szCs w:val="20"/>
+        </w:rPr>
+        <w:t xml:space="preserve">The legal heirs join me </w:t>
+      </w:r>
+      <w:r>
+        <w:rPr>
+          <w:sz w:val="20"/>
+          <w:szCs w:val="20"/>
+        </w:rPr>
+        <w:t xml:space="preserve">in </w:t>
+      </w:r>
+      <w:r>
+        <w:rPr>
+          <w:sz w:val="20"/>
+          <w:szCs w:val="20"/>
+        </w:rPr>
+        <w:t>thanking you with kind regards.</w:t>
       </w:r>
     </w:p>
     <w:p>
@@ -1192,7 +1289,7 @@
       </w:r>
       <w:r>
         <w:drawing>
-          <wp:anchor behindDoc="0" distT="0" distB="0" distL="0" distR="0" simplePos="0" locked="0" layoutInCell="1" allowOverlap="1" relativeHeight="2">
+          <wp:anchor distT="0" distB="0" distL="0" distR="0" simplePos="0" relativeHeight="2" behindDoc="0" locked="0" layoutInCell="1" allowOverlap="1">
             <wp:simplePos x="0" y="0"/>
             <wp:positionH relativeFrom="column">
               <wp:posOffset>156210</wp:posOffset>
@@ -1333,7 +1430,7 @@
       </w:tblPr>
       <w:tblGrid>
         <w:gridCol w:w="4985"/>
-        <w:gridCol w:w="4986"/>
+        <w:gridCol w:w="4987"/>
       </w:tblGrid>
       <w:tr>
         <w:trPr/>
@@ -1468,7 +1565,7 @@
         </w:tc>
         <w:tc>
           <w:tcPr>
-            <w:tcW w:w="4986" w:type="dxa"/>
+            <w:tcW w:w="4987" w:type="dxa"/>
             <w:tcBorders/>
           </w:tcPr>
           <w:p>
@@ -1717,7 +1814,7 @@
     </w:tblPr>
     <w:tblGrid>
       <w:gridCol w:w="3716"/>
-      <w:gridCol w:w="6255"/>
+      <w:gridCol w:w="6256"/>
     </w:tblGrid>
     <w:tr>
       <w:trPr/>
@@ -1738,7 +1835,6 @@
             <w:rPr>
               <w:rFonts w:ascii="Arial" w:hAnsi="Arial"/>
               <w:i w:val="false"/>
-              <w:i w:val="false"/>
               <w:caps w:val="false"/>
               <w:smallCaps w:val="false"/>
               <w:color w:val="auto"/>
@@ -1757,7 +1853,7 @@
       </w:tc>
       <w:tc>
         <w:tcPr>
-          <w:tcW w:w="6255" w:type="dxa"/>
+          <w:tcW w:w="6256" w:type="dxa"/>
           <w:tcBorders/>
         </w:tcPr>
         <w:tbl>
@@ -1775,7 +1871,7 @@
           </w:tblPr>
           <w:tblGrid>
             <w:gridCol w:w="5250"/>
-            <w:gridCol w:w="947"/>
+            <w:gridCol w:w="948"/>
           </w:tblGrid>
           <w:tr>
             <w:trPr/>
@@ -1820,7 +1916,7 @@
                     <w:sz w:val="18"/>
                     <w:szCs w:val="18"/>
                   </w:rPr>
-                  <w:t>CDCSR-25-03-MAK-SNGP-125005252-FL</w:t>
+                  <w:t>MAK-SNGP-26-01</w:t>
                 </w:r>
                 <w:r>
                   <w:rPr>
@@ -1833,7 +1929,7 @@
             </w:tc>
             <w:tc>
               <w:tcPr>
-                <w:tcW w:w="947" w:type="dxa"/>
+                <w:tcW w:w="948" w:type="dxa"/>
                 <w:tcBorders/>
               </w:tcPr>
               <w:p>
@@ -1988,7 +2084,7 @@
     </w:tblPr>
     <w:tblGrid>
       <w:gridCol w:w="3716"/>
-      <w:gridCol w:w="6255"/>
+      <w:gridCol w:w="6256"/>
     </w:tblGrid>
     <w:tr>
       <w:trPr/>
@@ -2009,7 +2105,6 @@
             <w:rPr>
               <w:rFonts w:ascii="Arial" w:hAnsi="Arial"/>
               <w:i w:val="false"/>
-              <w:i w:val="false"/>
               <w:caps w:val="false"/>
               <w:smallCaps w:val="false"/>
               <w:color w:val="auto"/>
@@ -2028,7 +2123,7 @@
       </w:tc>
       <w:tc>
         <w:tcPr>
-          <w:tcW w:w="6255" w:type="dxa"/>
+          <w:tcW w:w="6256" w:type="dxa"/>
           <w:tcBorders/>
         </w:tcPr>
         <w:tbl>
@@ -2046,7 +2141,7 @@
           </w:tblPr>
           <w:tblGrid>
             <w:gridCol w:w="5250"/>
-            <w:gridCol w:w="947"/>
+            <w:gridCol w:w="948"/>
           </w:tblGrid>
           <w:tr>
             <w:trPr/>
@@ -2091,7 +2186,7 @@
                     <w:sz w:val="18"/>
                     <w:szCs w:val="18"/>
                   </w:rPr>
-                  <w:t>CDCSR-25-03-MAK-SNGP-125005252-FL</w:t>
+                  <w:t>MAK-SNGP-26-01</w:t>
                 </w:r>
                 <w:r>
                   <w:rPr>
@@ -2104,7 +2199,7 @@
             </w:tc>
             <w:tc>
               <w:tcPr>
-                <w:tcW w:w="947" w:type="dxa"/>
+                <w:tcW w:w="948" w:type="dxa"/>
                 <w:tcBorders/>
               </w:tcPr>
               <w:p>
@@ -2890,7 +2985,7 @@
     <w:pPr>
       <w:widowControl/>
       <w:suppressAutoHyphens w:val="true"/>
-      <w:overflowPunct w:val="true"/>
+      <w:overflowPunct w:val="false"/>
       <w:bidi w:val="0"/>
       <w:spacing w:before="0" w:after="0"/>
       <w:jc w:val="start"/>
@@ -2940,8 +3035,8 @@
       <w:bCs/>
     </w:rPr>
   </w:style>
-  <w:style w:type="character" w:styleId="Bullets">
-    <w:name w:val="Bullets"/>
+  <w:style w:type="character" w:styleId="Bulletsuser">
+    <w:name w:val="Bullets (user)"/>
     <w:qFormat/>
     <w:rPr>
       <w:rFonts w:ascii="OpenSymbol" w:hAnsi="OpenSymbol" w:eastAsia="OpenSymbol" w:cs="OpenSymbol"/>
@@ -3024,7 +3119,7 @@
     <w:pPr>
       <w:widowControl/>
       <w:suppressAutoHyphens w:val="true"/>
-      <w:overflowPunct w:val="true"/>
+      <w:overflowPunct w:val="false"/>
       <w:bidi w:val="0"/>
       <w:spacing w:before="0" w:after="0"/>
       <w:jc w:val="start"/>
@@ -3141,37 +3236,37 @@
         <a:srgbClr val="000000"/>
       </a:dk1>
       <a:lt1>
-        <a:srgbClr val="ffffff"/>
+        <a:srgbClr val="FFFFFF"/>
       </a:lt1>
       <a:dk2>
         <a:srgbClr val="000000"/>
       </a:dk2>
       <a:lt2>
-        <a:srgbClr val="ffffff"/>
+        <a:srgbClr val="FFFFFF"/>
       </a:lt2>
       <a:accent1>
-        <a:srgbClr val="18a303"/>
+        <a:srgbClr val="18A303"/>
       </a:accent1>
       <a:accent2>
-        <a:srgbClr val="0369a3"/>
+        <a:srgbClr val="0369A3"/>
       </a:accent2>
       <a:accent3>
-        <a:srgbClr val="a33e03"/>
+        <a:srgbClr val="A33E03"/>
       </a:accent3>
       <a:accent4>
-        <a:srgbClr val="8e03a3"/>
+        <a:srgbClr val="8E03A3"/>
       </a:accent4>
       <a:accent5>
-        <a:srgbClr val="c99c00"/>
+        <a:srgbClr val="C99C00"/>
       </a:accent5>
       <a:accent6>
-        <a:srgbClr val="c9211e"/>
+        <a:srgbClr val="C9211E"/>
       </a:accent6>
       <a:hlink>
-        <a:srgbClr val="0000ee"/>
+        <a:srgbClr val="0000EE"/>
       </a:hlink>
       <a:folHlink>
-        <a:srgbClr val="551a8b"/>
+        <a:srgbClr val="551A8B"/>
       </a:folHlink>
     </a:clrScheme>
     <a:fontScheme name="Office">

</xml_diff>